<commit_message>
feat(defense): rewrite 20-min script to natural spoken prose, add red-team Q&A bank
Rewrites the 34-slide script generator's talk-track from slide-reading phrasing
into natural spoken prose (contractions, varied rhythm, transitions) while
keeping every number/fact identical. Adds the 30-question red-team Q&A bank
(Framework-Evidence-Application structure + pivot strategy) used for mock-viva
drilling ahead of the 8-Jul defense.

Co-Authored-By: Claude Sonnet 5 <noreply@anthropic.com>
</commit_message>
<xml_diff>
--- a/thesis/health_rl/Poly_defense_script_20min.docx
+++ b/thesis/health_rl/Poly_defense_script_20min.docx
@@ -130,7 +130,7 @@
         <w:rPr>
           <w:sz w:val="22"/>
         </w:rPr>
-        <w:t>Good morning, Distinguished Committee. I am Lun Chanpoly, defending Adaptive Health Insurance Underwriting via Contextual Bandits — a Reinforcement Learning approach for Cambodia, from my internship at Decent Actuarial Consultants under Dr. Has Sothea and Mr. ON Radet.</w:t>
+        <w:t>Good morning, Distinguished Committee. My name is Lun Chanpoly, and I'm here to defend Adaptive Health Insurance Underwriting via Contextual Bandits — a reinforcement learning approach for Cambodia. This grew out of my internship at Decent Actuarial Consultants, under Dr. Has Sothea and Mr. ON Radet.</w:t>
       </w:r>
     </w:p>
     <w:p>
@@ -141,7 +141,7 @@
         <w:rPr>
           <w:sz w:val="22"/>
         </w:rPr>
-        <w:t>Seven short sections, plain language, maths in the appendix. Let me start with a person named Sophea.</w:t>
+        <w:t>I've kept this to seven short sections, in plain language — the math lives in the appendix if you want it. But I'd rather start with a person. Her name is Sophea.</w:t>
       </w:r>
     </w:p>
     <w:p/>
@@ -216,7 +216,7 @@
         <w:rPr>
           <w:sz w:val="22"/>
         </w:rPr>
-        <w:t>Here's the roadmap — problem, literature, design, results, conclusion, and a live demo. [Advance.]</w:t>
+        <w:t>Quick roadmap: the problem, what's been tried before, how I built this, what it found, and then I'll show it to you live. [Advance.]</w:t>
       </w:r>
     </w:p>
     <w:p/>
@@ -291,7 +291,7 @@
         <w:rPr>
           <w:sz w:val="22"/>
         </w:rPr>
-        <w:t>This is Sophea's market. In Cambodia, fewer than two percent have any health insurance. The state scheme reaches only formal workers — about sixteen percent. Everyone else is underwritten by hand. Sophea represents the ninety-eight percent the system was not built for.</w:t>
+        <w:t>This is the market Sophea lives in. In Cambodia, fewer than two percent of people carry any health insurance at all. The state scheme only reaches formal-sector workers — roughly sixteen percent of the workforce. Everyone else? Underwritten by hand, one judgment call at a time. Sophea is part of that other ninety-eight percent — the market this system was never built for.</w:t>
       </w:r>
     </w:p>
     <w:p/>
@@ -377,7 +377,7 @@
         <w:rPr>
           <w:sz w:val="22"/>
         </w:rPr>
-        <w:t>Sophea: 42, a rice farmer from Kampong Cham. Active, non-smoker, BMI 24.1, one flag — managed hypertension.</w:t>
+        <w:t>Meet Sophea. She's forty-two, a rice farmer in Kampong Cham. Active, doesn't smoke, BMI of 24.1 — and one flag on her chart: managed hypertension.</w:t>
       </w:r>
     </w:p>
     <w:p>
@@ -388,7 +388,18 @@
         <w:rPr>
           <w:sz w:val="22"/>
         </w:rPr>
-        <w:t>In 2023 she applies for cover. The static system checks two fields — occupation agriculture, condition hypertension — both cross a threshold. Decision: DECLINE. Was that the right answer?</w:t>
+        <w:t>In 2023, she applies for cover. The static system looks at exactly two fields — occupation is agriculture, condition is hypertension — and both cross a hard-coded threshold. The decision comes back: DECLINE.</w:t>
+      </w:r>
+    </w:p>
+    <w:p>
+      <w:pPr>
+        <w:spacing w:before="80" w:after="80"/>
+      </w:pPr>
+      <w:r>
+        <w:rPr>
+          <w:sz w:val="22"/>
+        </w:rPr>
+        <w:t>Was that the right call?</w:t>
       </w:r>
     </w:p>
     <w:p/>
@@ -463,7 +474,7 @@
         <w:rPr>
           <w:sz w:val="22"/>
         </w:rPr>
-        <w:t>The rule couldn't have known. It can't see her full picture, and it never learns. Three problems: fixed cutoffs that ignore context, a model that never updates from claims, and no one checking whether whole groups get shut out.</w:t>
+        <w:t>Here's the problem — the rule couldn't have known better. It only sees two fields, not her whole picture, and it never learns from what actually happens afterward. Three things are broken here: the cutoffs are fixed and ignore context, the model never updates itself from real claims, and nobody's checking whether whole groups are quietly getting shut out.</w:t>
       </w:r>
     </w:p>
     <w:p/>
@@ -538,7 +549,7 @@
         <w:rPr>
           <w:sz w:val="22"/>
         </w:rPr>
-        <w:t>The goal in one sentence: can a system that learns from every decision underwrite better — and stay fair — than today's fixed rules? Three questions: does it earn more, does it stay fair without being told to, and which method wins. And it touches three of Cambodia's SDGs — health, poverty, and inequality.</w:t>
+        <w:t>So here's the goal, in one sentence: can a system that learns from every decision underwrite better — and stay fairer — than today's fixed rules? That breaks into three questions I set out to answer: does it earn more money, does it stay fair without anyone telling it to, and which learning method actually wins. And underneath all of that, this touches three of Cambodia's Sustainable Development Goals — health, poverty, and inequality.</w:t>
       </w:r>
     </w:p>
     <w:p/>
@@ -613,7 +624,7 @@
         <w:rPr>
           <w:sz w:val="22"/>
         </w:rPr>
-        <w:t>I did this at Decent Actuarial Consultants — a regional actuarial firm across Taiwan, Vietnam and Cambodia, whose clients face applicants like Sophea daily. My task: design, validate, and prototype an adaptive underwriting system.</w:t>
+        <w:t>I did this work at Decent Actuarial Consultants — a regional actuarial firm operating across Taiwan, Vietnam, and Cambodia. Their clients face applicants like Sophea every single day. My task was to design, validate, and prototype an adaptive underwriting system for exactly that problem.</w:t>
       </w:r>
     </w:p>
     <w:p/>
@@ -688,7 +699,7 @@
         <w:rPr>
           <w:sz w:val="22"/>
         </w:rPr>
-        <w:t>A three-month internship: research and modelling, then experiments, then engineering the demo and writing up. [Advance.]</w:t>
+        <w:t>Three months, roughly three phases: research and modelling first, then the experiments, then building the demo and writing it all up. [Advance.]</w:t>
       </w:r>
     </w:p>
     <w:p/>
@@ -763,7 +774,7 @@
         <w:rPr>
           <w:sz w:val="22"/>
         </w:rPr>
-        <w:t>Four bodies of work, in one table: emerging-market health insurance, contextual bandits — the method at the core of this, from Li 2010 and Agrawal and Goyal 2013 — fairness and drift monitoring, and human-in-the-loop review. The gap: no prior work applies online-learning underwriting to Cambodia.</w:t>
+        <w:t>I pulled together four bodies of work into one table. Emerging-market health insurance. Contextual bandits — the method at the core of this thesis, going back to Li in 2010 and Agrawal and Goyal in 2013. Fairness and drift monitoring. And human-in-the-loop review. Put them side by side, and one gap jumps out: nobody had applied online-learning underwriting to Cambodia before.</w:t>
       </w:r>
     </w:p>
     <w:p/>
@@ -838,7 +849,7 @@
         <w:rPr>
           <w:sz w:val="22"/>
         </w:rPr>
-        <w:t>The whole system on one line: it decides, sees what happens, and gets a little smarter each round. It reads a short profile, picks one of four actions, earns a reward, checks fairness, and refers the uncertain cases to a human.</w:t>
+        <w:t>The whole system, in one line: it decides, watches what happens, and gets a little smarter every round. Concretely — it reads a short applicant profile, picks one of four actions, earns a reward based on the outcome, checks itself for fairness, and hands off the uncertain cases to a human.</w:t>
       </w:r>
     </w:p>
     <w:p/>
@@ -913,7 +924,7 @@
         <w:rPr>
           <w:sz w:val="22"/>
         </w:rPr>
-        <w:t>Watch it decide for Sophea. On the left, what it knows — a short profile. It scores the four options: Standard highest at 0.52, then Rated, Refer, Decline. Highest wins, so Sophea gets Standard. In plain words: it estimates how each option pays off, plus a small bonus for options it hasn't tried much.</w:t>
+        <w:t>Let's watch it actually decide, for Sophea specifically. On the left is everything it knows about her — that short profile. It scores all four options: Standard comes out highest at 0.52, then Rated, then Refer, then Decline. Highest score wins, so Sophea gets Standard. In plain words, it's estimating how each option would pay off — plus a small bonus for options it hasn't tried very often yet.</w:t>
       </w:r>
     </w:p>
     <w:p/>
@@ -988,7 +999,7 @@
         <w:rPr>
           <w:sz w:val="22"/>
         </w:rPr>
-        <w:t>Reward is simple: premiums collected minus claims paid. Insure someone healthy, you earn; a frequent claimer, you lose; decline everyone, you earn nothing. So it's rewarded for insuring the right people at the right price.</w:t>
+        <w:t>The reward function is deliberately simple: premiums collected, minus claims paid. Insure someone healthy, and you earn. Insure a frequent claimer, and you lose. Decline everyone, and you earn nothing at all. So the incentive is exactly what you'd want — insure the right people, at the right price.</w:t>
       </w:r>
     </w:p>
     <w:p/>
@@ -1063,7 +1074,7 @@
         <w:rPr>
           <w:sz w:val="22"/>
         </w:rPr>
-        <w:t>The fairness guardrail, PSI, asks one question: are the people we approve today drifting away from the people we trained on? A traffic light — green below 0.10, amber to 0.25, red above. And uncertain cases go to a human, about one in seventy.</w:t>
+        <w:t>The fairness guardrail is called PSI, and it asks one question: are the people we're approving today drifting away from the people we originally trained on? Think of it as a traffic light — green below 0.10, amber up to 0.25, red above that. And whenever the system's uncertain, it hands the case to a human — that's about one in every seventy applicants.</w:t>
       </w:r>
     </w:p>
     <w:p/>
@@ -1138,7 +1149,7 @@
         <w:rPr>
           <w:sz w:val="22"/>
         </w:rPr>
-        <w:t>Two thousand synthetic applicants, thirty-four facts each, four decisions. Synthetic because no insurer shares real records — but shaped to match published Cambodia statistics: CDHS, STEPS, ILO, WHO.</w:t>
+        <w:t>The dataset is two thousand synthetic applicants, thirty-four facts each, across four possible decisions. Synthetic, because no insurer was going to share real records with me — but shaped carefully to match published Cambodia statistics: the CDHS, STEPS, ILO, and WHO surveys.</w:t>
       </w:r>
     </w:p>
     <w:p/>
@@ -1213,7 +1224,7 @@
         <w:rPr>
           <w:sz w:val="22"/>
         </w:rPr>
-        <w:t>Five thousand applicants one at a time, twenty independent repeats — the learning system won every time — head-to-head against the static rules. A bandit has no train/test split, so I judge it by reward lost versus a perfect Oracle, averaged over the twenty repeats.</w:t>
+        <w:t>I ran five thousand applicants through, one at a time, twenty independent repeats — head-to-head against the static rules. The learning system won every single time. Now, a bandit doesn't have a train/test split the way a normal model does, so instead I judge it by how much reward it loses compared to a perfect Oracle, averaged across those twenty repeats.</w:t>
       </w:r>
     </w:p>
     <w:p/>
@@ -1288,7 +1299,7 @@
         <w:rPr>
           <w:sz w:val="22"/>
         </w:rPr>
-        <w:t>The headline: twenty-five point two percent more reward than the static rules — $90,540 versus $72,292, over twenty seeds. In plain words, for every hundred dollars the old rules earned, the learning system earned a hundred and twenty-five — and the gap held across all twenty repeats. p below 0.001, d of 2.98.</w:t>
+        <w:t>So here's the headline number: twenty-five point two percent more reward than the static rules — $90,540 against $72,292, averaged over twenty seeds. Put plainly, for every hundred dollars the old rules earned, the learning system earned a hundred and twenty-five. And this wasn't a lucky run — the gap held across all twenty repeats, p below 0.001, effect size d of 2.98.</w:t>
       </w:r>
     </w:p>
     <w:p/>
@@ -1363,7 +1374,7 @@
         <w:rPr>
           <w:sz w:val="22"/>
         </w:rPr>
-        <w:t>Against a full ladder, every realistic alternative lands below the bandits. Two things sit above them — the Oracle, which sees the future, and AlwaysRATED, which rates everyone at a flat loading and no regulator would allow. Among deployable policies, the bandit leads.</w:t>
+        <w:t>I didn't just compare against one baseline — I built a full ladder of them. And every realistic alternative lands below the bandit. Only two things sit above it: the Oracle, which cheats by seeing the future, and AlwaysRATED, which just rates every single applicant at a flat loading — something no regulator would ever actually allow. Among the policies you could actually deploy, the bandit leads.</w:t>
       </w:r>
     </w:p>
     <w:p/>
@@ -1438,7 +1449,7 @@
         <w:rPr>
           <w:sz w:val="22"/>
         </w:rPr>
-        <w:t>The same applicant, three systems. Static rules say DECLINE. Our LinUCB bandit says STANDARD. And the perfect-knowledge Oracle also says STANDARD. The bandit reaches the answer the all-knowing benchmark picks — the static rule never can.</w:t>
+        <w:t>Same applicant, three systems, three answers. The static rules say DECLINE. Our LinUCB bandit says STANDARD. And the Oracle — the one with perfect, all-knowing information — also says STANDARD. So the bandit lands on the same answer as the all-knowing benchmark. The static rule never gets there.</w:t>
       </w:r>
     </w:p>
     <w:p/>
@@ -1513,7 +1524,7 @@
         <w:rPr>
           <w:sz w:val="22"/>
         </w:rPr>
-        <w:t>Is it fair, and does oversight help? Region drift green at 0.082, occupation amber at 0.123, approval parity 85.7 and 90.1 percent — above the eighty-percent rule. One of six checks failed narrowly on occupation; I report it, no threshold breached. And a human review lifts reward by fourteen point eight percent for a 2.2 percent cost — one case in seventy.</w:t>
+        <w:t>Two questions here: is it fair, and does human oversight actually help? On fairness — region drift is green at 0.082, occupation is amber at 0.123, and approval parity sits at 85.7 and 90.1 percent, both clearing the eighty-percent rule. One of six checks came in narrowly on occupation — I report that honestly, though no threshold was actually breached. And on oversight — adding a human reviewer lifts reward by fourteen point eight percent, for a cost of just 2.2 percent of cases, about one in seventy.</w:t>
       </w:r>
     </w:p>
     <w:p/>
@@ -1588,7 +1599,7 @@
         <w:rPr>
           <w:sz w:val="22"/>
         </w:rPr>
-        <w:t>Four findings: learning beats static rules by twenty-five percent; no bias introduced; it's the learning, not the exploration, that does the work; and human oversight adds value cheaply. And the honest limits: synthetic data, single-period reward, one country — a constant policy still tops the ladder.</w:t>
+        <w:t>So, what does this actually add up to? Four findings. Learning beats static rules by twenty-five percent. It doesn't introduce new bias while doing it. It's the learning itself doing the work, not just lucky exploration — I checked. And human oversight adds real value, cheaply. Now, the honest limits, because there are some: this is synthetic data, a single-period reward, one country — and a constant policy still tops the full ladder.</w:t>
       </w:r>
     </w:p>
     <w:p/>
@@ -1663,7 +1674,7 @@
         <w:rPr>
           <w:sz w:val="22"/>
         </w:rPr>
-        <w:t>Four directions: handle change over time with forgetting plus PSI early warning; richer neural models; a real shadow-mode trial with a Cambodian insurer; and lifetime customer value beyond a single decision.</w:t>
+        <w:t>Looking ahead, four directions feel worth chasing: handling change over time, using forgetting alongside PSI as an early-warning system; richer neural models; an actual shadow-mode trial with a Cambodian insurer; and thinking about lifetime customer value, not just a single decision.</w:t>
       </w:r>
     </w:p>
     <w:p/>
@@ -1738,7 +1749,7 @@
         <w:rPr>
           <w:sz w:val="22"/>
         </w:rPr>
-        <w:t>So, to close: in 2023 the static system declined Sophea; in 2026 the learning system offers her Standard cover. The same woman — a system that finally sees her whole picture. And Cambodia has hundreds of thousands like her.</w:t>
+        <w:t>So, to close where I started. In 2023, the static system declined Sophea. Run the same profile through the learning system today, and it offers her Standard cover. Same woman — but finally, a system that sees her whole picture. And Cambodia has hundreds of thousands more like her.</w:t>
       </w:r>
     </w:p>
     <w:p/>
@@ -1824,7 +1835,7 @@
         <w:rPr>
           <w:sz w:val="22"/>
         </w:rPr>
-        <w:t>First I score Sophea live with the fairness guardrail on screen. Then a higher-risk applicant, to show the decision and reward change. Then 'Watch it Learn' — the cumulative-reward animation, the learning system pulling ahead of the static rules.</w:t>
+        <w:t>Let me show you this actually running. First, I'll score Sophea live, right here, with the fairness guardrail visible on screen. Then I'll run a higher-risk applicant through, so you can see the decision and the reward change. And finally, 'Watch it Learn' — a live animation of cumulative reward, watching the learning system pull ahead of the static rules in real time.</w:t>
       </w:r>
     </w:p>
     <w:p/>
@@ -1899,7 +1910,7 @@
         <w:rPr>
           <w:sz w:val="22"/>
         </w:rPr>
-        <w:t>[Backup only.] A captured Underwriting Desk screenshot — a sample applicant scored, decision and fairness guardrail shown.</w:t>
+        <w:t>[Backup only.] If the live demo didn't cooperate — here's a captured screenshot from the Underwriting Desk, a sample applicant already scored, decision and fairness guardrail both visible.</w:t>
       </w:r>
     </w:p>
     <w:p/>
@@ -1974,7 +1985,7 @@
         <w:rPr>
           <w:sz w:val="22"/>
         </w:rPr>
-        <w:t>[Backup only.] The cumulative-reward curve — learning system versus static rules — as the live animation renders it.</w:t>
+        <w:t>[Backup only.] And here's the cumulative-reward curve itself — learning system against static rules — exactly as the live animation would have rendered it.</w:t>
       </w:r>
     </w:p>
     <w:p/>
@@ -2049,7 +2060,7 @@
         <w:rPr>
           <w:sz w:val="22"/>
         </w:rPr>
-        <w:t>That is my thesis. Thank you for your attention — I welcome your questions. If a question targets a number, I have eight appendix slides on standby.</w:t>
+        <w:t>That's my thesis. Thank you for your attention — I'd welcome your questions. And if a question needs a specific number, I've got eight appendix slides standing by.</w:t>
       </w:r>
     </w:p>
     <w:p/>
@@ -2124,7 +2135,7 @@
         <w:rPr>
           <w:sz w:val="22"/>
         </w:rPr>
-        <w:t>The three percentages. Plus 25.2 percent is the headline — LinUCB vs Static XGB, pre-registered. Plus 29.8 percent is LinTS on a different harness. Plus 14.8 percent is the human-in-the-loop gain over the vanilla bandit across twenty seeds. At the single seed 42 that same HITL comparison reads plus 6.5 percent — one seed, not twenty; I quote the twenty-seed 14.8 percent.</w:t>
+        <w:t>Let's untangle the three percentages you might have seen. Plus 25.2 percent is the headline — LinUCB against Static XGB, pre-registered before I ran it. Plus 29.8 percent is LinTS, measured on a different harness. And plus 14.8 percent is the human-in-the-loop gain over the vanilla bandit, across twenty seeds. If you only look at seed 42 alone, that same HITL comparison reads plus 6.5 percent — but that's one seed, not twenty, and the number I actually quote and stand behind is the twenty-seed 14.8 percent.</w:t>
       </w:r>
     </w:p>
     <w:p/>
@@ -2199,7 +2210,7 @@
         <w:rPr>
           <w:sz w:val="22"/>
         </w:rPr>
-        <w:t>A supervised model splits data, fits once, freezes. A bandit meets applicants one at a time — every round is both train and test, regularised online by a ridge prior, so there's no static fit to overfit. I measure generalisation as cumulative regret versus the Oracle over twenty seeds; the Static XGB baseline is fit offline and frozen, so the comparison is fair.</w:t>
+        <w:t>Good question, and it's a fair one. A supervised model splits its data, fits once, and freezes. A bandit doesn't work that way — it meets applicants one at a time, so every single round is both training and testing at once, regularised online by a ridge prior, which means there's no static fit sitting around to overfit. So instead, I measure generalisation as cumulative regret against the Oracle, averaged over twenty seeds. And the Static XGB baseline, by contrast, is fit offline and frozen — so the comparison between them is still fair.</w:t>
       </w:r>
     </w:p>
     <w:p/>

</xml_diff>

<commit_message>
fix(defense): rebuild PSI slide with real sliding-window sparkline, fix train/test-split error
Slide 13 stated PSI compares approvals against "the people we trained
on" -- bandits have no train/test split, so this was wrong (and
contradicted slide 15's own script, which already gets this right).
PSI's actual reference is the system's own first 500 live decisions,
checked via sliding 500-round windows for the rest of the run.

Replaces the static GREEN/AMBER/RED zone legend with a real chart
(gen_slide_figures.py: new fig_psi(), reuses the exp_006 20-seed
harness, reproduces frozen numbers 0.0821/0.1225 exactly) so the
drift claim is shown, not just stated. Same wording fix applied to
Appendix A8 and the two speaker-note/script generators.

Co-Authored-By: Claude Sonnet 5 <noreply@anthropic.com>
</commit_message>
<xml_diff>
--- a/thesis/health_rl/Poly_defense_script_20min.docx
+++ b/thesis/health_rl/Poly_defense_script_20min.docx
@@ -55,7 +55,7 @@
           <w:b/>
           <w:sz w:val="20"/>
         </w:rPr>
-        <w:t>Budgeted talk-time (excluding 'skip if live demo worked' and Q&amp;A slides): ~11 min 35 sec</w:t>
+        <w:t>Budgeted talk-time (excluding 'skip if live demo worked' and Q&amp;A slides): ~11 min 40 sec</w:t>
       </w:r>
     </w:p>
     <w:p/>
@@ -1074,7 +1074,7 @@
         <w:rPr>
           <w:sz w:val="22"/>
         </w:rPr>
-        <w:t>The fairness guardrail is called PSI, and it asks one question: are the people we're approving today drifting away from the people we originally trained on? Think of it as a traffic light — green below 0.10, amber up to 0.25, red above that. And whenever the system's uncertain, it hands the case to a human — that's about one in every seventy applicants.</w:t>
+        <w:t>The fairness guardrail is called PSI. A bandit has no training set, so instead it checks itself: it freezes who it approved in its first 500 decisions, then keeps comparing later windows back to that snapshot. This chart traces that across the run — it wobbles while exploring, then settles as the policy converges. Green below 0.10, amber up to 0.25, red above that — it never breaches red.</w:t>
       </w:r>
     </w:p>
     <w:p/>
@@ -1174,7 +1174,7 @@
           <w:color w:val="707070"/>
           <w:sz w:val="18"/>
         </w:rPr>
-        <w:t>Timing budget: 25 sec</w:t>
+        <w:t>Timing budget: 30 sec</w:t>
       </w:r>
     </w:p>
     <w:p>
@@ -1224,7 +1224,7 @@
         <w:rPr>
           <w:sz w:val="22"/>
         </w:rPr>
-        <w:t>I ran five thousand applicants through, one at a time, twenty independent repeats — head-to-head against the static rules. The learning system won every single time. Now, a bandit doesn't have a train/test split the way a normal model does, so instead I judge it by how much reward it loses compared to a perfect Oracle, averaged across those twenty repeats.</w:t>
+        <w:t>Same two thousand applicants as before, run through the system five thousand times — two and a half passes, reshuffled each time, one at a time — twenty independent repeats, head-to-head against the static rules. The learning system won every single time. Now, a bandit doesn't have a train/test split the way a normal model does, so instead I judge it by how much reward it loses compared to a perfect Oracle, averaged across those twenty repeats.</w:t>
       </w:r>
     </w:p>
     <w:p/>

</xml_diff>